<commit_message>
Rename ADRs to imperative form, mirror docs layout in dist
MADR names decisions as verb phrases (use-, do-not-use-, require-), which
also matches commit message style. Generated files now go to dist/adr/ and
dist/spikes/ instead of carrying a flattened adr- prefix.
</commit_message>
<xml_diff>
--- a/docs/dist/architecture.docx
+++ b/docs/dist/architecture.docx
@@ -1543,7 +1543,7 @@
               <a:graphicData uri="http://schemas.openxmlformats.org/drawingml/2006/picture">
                 <pic:pic>
                   <pic:nvPicPr>
-                    <pic:cNvPr descr="C:/Users/laxmi/AppData/Local/Temp/nova-docs-476d0089/architecture-1.png" id="17" name="Picture"/>
+                    <pic:cNvPr descr="C:/Users/laxmi/AppData/Local/Temp/nova-docs-90a94cb5/architecture-1.png" id="17" name="Picture"/>
                     <pic:cNvPicPr>
                       <a:picLocks noChangeArrowheads="1" noChangeAspect="1"/>
                     </pic:cNvPicPr>
@@ -2334,7 +2334,7 @@
               <a:graphicData uri="http://schemas.openxmlformats.org/drawingml/2006/picture">
                 <pic:pic>
                   <pic:nvPicPr>
-                    <pic:cNvPr descr="C:/Users/laxmi/AppData/Local/Temp/nova-docs-476d0089/architecture-2.png" id="28" name="Picture"/>
+                    <pic:cNvPr descr="C:/Users/laxmi/AppData/Local/Temp/nova-docs-90a94cb5/architecture-2.png" id="28" name="Picture"/>
                     <pic:cNvPicPr>
                       <a:picLocks noChangeArrowheads="1" noChangeAspect="1"/>
                     </pic:cNvPicPr>
@@ -2391,7 +2391,7 @@
               <a:graphicData uri="http://schemas.openxmlformats.org/drawingml/2006/picture">
                 <pic:pic>
                   <pic:nvPicPr>
-                    <pic:cNvPr descr="C:/Users/laxmi/AppData/Local/Temp/nova-docs-476d0089/architecture-3.png" id="32" name="Picture"/>
+                    <pic:cNvPr descr="C:/Users/laxmi/AppData/Local/Temp/nova-docs-90a94cb5/architecture-3.png" id="32" name="Picture"/>
                     <pic:cNvPicPr>
                       <a:picLocks noChangeArrowheads="1" noChangeAspect="1"/>
                     </pic:cNvPicPr>
@@ -2917,7 +2917,7 @@
               <a:graphicData uri="http://schemas.openxmlformats.org/drawingml/2006/picture">
                 <pic:pic>
                   <pic:nvPicPr>
-                    <pic:cNvPr descr="C:/Users/laxmi/AppData/Local/Temp/nova-docs-476d0089/architecture-4.png" id="38" name="Picture"/>
+                    <pic:cNvPr descr="C:/Users/laxmi/AppData/Local/Temp/nova-docs-90a94cb5/architecture-4.png" id="38" name="Picture"/>
                     <pic:cNvPicPr>
                       <a:picLocks noChangeArrowheads="1" noChangeAspect="1"/>
                     </pic:cNvPicPr>
@@ -2974,7 +2974,7 @@
               <a:graphicData uri="http://schemas.openxmlformats.org/drawingml/2006/picture">
                 <pic:pic>
                   <pic:nvPicPr>
-                    <pic:cNvPr descr="C:/Users/laxmi/AppData/Local/Temp/nova-docs-476d0089/architecture-5.png" id="42" name="Picture"/>
+                    <pic:cNvPr descr="C:/Users/laxmi/AppData/Local/Temp/nova-docs-90a94cb5/architecture-5.png" id="42" name="Picture"/>
                     <pic:cNvPicPr>
                       <a:picLocks noChangeArrowheads="1" noChangeAspect="1"/>
                     </pic:cNvPicPr>
@@ -3031,7 +3031,7 @@
               <a:graphicData uri="http://schemas.openxmlformats.org/drawingml/2006/picture">
                 <pic:pic>
                   <pic:nvPicPr>
-                    <pic:cNvPr descr="C:/Users/laxmi/AppData/Local/Temp/nova-docs-476d0089/architecture-6.png" id="46" name="Picture"/>
+                    <pic:cNvPr descr="C:/Users/laxmi/AppData/Local/Temp/nova-docs-90a94cb5/architecture-6.png" id="46" name="Picture"/>
                     <pic:cNvPicPr>
                       <a:picLocks noChangeArrowheads="1" noChangeAspect="1"/>
                     </pic:cNvPicPr>
@@ -3394,7 +3394,7 @@
               <a:graphicData uri="http://schemas.openxmlformats.org/drawingml/2006/picture">
                 <pic:pic>
                   <pic:nvPicPr>
-                    <pic:cNvPr descr="C:/Users/laxmi/AppData/Local/Temp/nova-docs-476d0089/architecture-7.png" id="52" name="Picture"/>
+                    <pic:cNvPr descr="C:/Users/laxmi/AppData/Local/Temp/nova-docs-90a94cb5/architecture-7.png" id="52" name="Picture"/>
                     <pic:cNvPicPr>
                       <a:picLocks noChangeArrowheads="1" noChangeAspect="1"/>
                     </pic:cNvPicPr>
@@ -3762,7 +3762,7 @@
               <a:graphicData uri="http://schemas.openxmlformats.org/drawingml/2006/picture">
                 <pic:pic>
                   <pic:nvPicPr>
-                    <pic:cNvPr descr="C:/Users/laxmi/AppData/Local/Temp/nova-docs-476d0089/architecture-8.png" id="57" name="Picture"/>
+                    <pic:cNvPr descr="C:/Users/laxmi/AppData/Local/Temp/nova-docs-90a94cb5/architecture-8.png" id="57" name="Picture"/>
                     <pic:cNvPicPr>
                       <a:picLocks noChangeArrowheads="1" noChangeAspect="1"/>
                     </pic:cNvPicPr>
@@ -5049,7 +5049,7 @@
               <a:graphicData uri="http://schemas.openxmlformats.org/drawingml/2006/picture">
                 <pic:pic>
                   <pic:nvPicPr>
-                    <pic:cNvPr descr="C:/Users/laxmi/AppData/Local/Temp/nova-docs-476d0089/architecture-9.png" id="73" name="Picture"/>
+                    <pic:cNvPr descr="C:/Users/laxmi/AppData/Local/Temp/nova-docs-90a94cb5/architecture-9.png" id="73" name="Picture"/>
                     <pic:cNvPicPr>
                       <a:picLocks noChangeArrowheads="1" noChangeAspect="1"/>
                     </pic:cNvPicPr>

</xml_diff>

<commit_message>
Define CON-7 in the requirements baseline
It was only in the SAD constraints table, so the ID had no definition in
the SRS the other documents trace to.
</commit_message>
<xml_diff>
--- a/docs/dist/architecture.docx
+++ b/docs/dist/architecture.docx
@@ -1543,7 +1543,7 @@
               <a:graphicData uri="http://schemas.openxmlformats.org/drawingml/2006/picture">
                 <pic:pic>
                   <pic:nvPicPr>
-                    <pic:cNvPr descr="C:/Users/laxmi/AppData/Local/Temp/nova-docs-90a94cb5/architecture-1.png" id="17" name="Picture"/>
+                    <pic:cNvPr descr="C:/Users/laxmi/AppData/Local/Temp/nova-docs-29bc2e55/architecture-1.png" id="17" name="Picture"/>
                     <pic:cNvPicPr>
                       <a:picLocks noChangeArrowheads="1" noChangeAspect="1"/>
                     </pic:cNvPicPr>
@@ -2334,7 +2334,7 @@
               <a:graphicData uri="http://schemas.openxmlformats.org/drawingml/2006/picture">
                 <pic:pic>
                   <pic:nvPicPr>
-                    <pic:cNvPr descr="C:/Users/laxmi/AppData/Local/Temp/nova-docs-90a94cb5/architecture-2.png" id="28" name="Picture"/>
+                    <pic:cNvPr descr="C:/Users/laxmi/AppData/Local/Temp/nova-docs-29bc2e55/architecture-2.png" id="28" name="Picture"/>
                     <pic:cNvPicPr>
                       <a:picLocks noChangeArrowheads="1" noChangeAspect="1"/>
                     </pic:cNvPicPr>
@@ -2391,7 +2391,7 @@
               <a:graphicData uri="http://schemas.openxmlformats.org/drawingml/2006/picture">
                 <pic:pic>
                   <pic:nvPicPr>
-                    <pic:cNvPr descr="C:/Users/laxmi/AppData/Local/Temp/nova-docs-90a94cb5/architecture-3.png" id="32" name="Picture"/>
+                    <pic:cNvPr descr="C:/Users/laxmi/AppData/Local/Temp/nova-docs-29bc2e55/architecture-3.png" id="32" name="Picture"/>
                     <pic:cNvPicPr>
                       <a:picLocks noChangeArrowheads="1" noChangeAspect="1"/>
                     </pic:cNvPicPr>
@@ -2917,7 +2917,7 @@
               <a:graphicData uri="http://schemas.openxmlformats.org/drawingml/2006/picture">
                 <pic:pic>
                   <pic:nvPicPr>
-                    <pic:cNvPr descr="C:/Users/laxmi/AppData/Local/Temp/nova-docs-90a94cb5/architecture-4.png" id="38" name="Picture"/>
+                    <pic:cNvPr descr="C:/Users/laxmi/AppData/Local/Temp/nova-docs-29bc2e55/architecture-4.png" id="38" name="Picture"/>
                     <pic:cNvPicPr>
                       <a:picLocks noChangeArrowheads="1" noChangeAspect="1"/>
                     </pic:cNvPicPr>
@@ -2974,7 +2974,7 @@
               <a:graphicData uri="http://schemas.openxmlformats.org/drawingml/2006/picture">
                 <pic:pic>
                   <pic:nvPicPr>
-                    <pic:cNvPr descr="C:/Users/laxmi/AppData/Local/Temp/nova-docs-90a94cb5/architecture-5.png" id="42" name="Picture"/>
+                    <pic:cNvPr descr="C:/Users/laxmi/AppData/Local/Temp/nova-docs-29bc2e55/architecture-5.png" id="42" name="Picture"/>
                     <pic:cNvPicPr>
                       <a:picLocks noChangeArrowheads="1" noChangeAspect="1"/>
                     </pic:cNvPicPr>
@@ -3031,7 +3031,7 @@
               <a:graphicData uri="http://schemas.openxmlformats.org/drawingml/2006/picture">
                 <pic:pic>
                   <pic:nvPicPr>
-                    <pic:cNvPr descr="C:/Users/laxmi/AppData/Local/Temp/nova-docs-90a94cb5/architecture-6.png" id="46" name="Picture"/>
+                    <pic:cNvPr descr="C:/Users/laxmi/AppData/Local/Temp/nova-docs-29bc2e55/architecture-6.png" id="46" name="Picture"/>
                     <pic:cNvPicPr>
                       <a:picLocks noChangeArrowheads="1" noChangeAspect="1"/>
                     </pic:cNvPicPr>
@@ -3394,7 +3394,7 @@
               <a:graphicData uri="http://schemas.openxmlformats.org/drawingml/2006/picture">
                 <pic:pic>
                   <pic:nvPicPr>
-                    <pic:cNvPr descr="C:/Users/laxmi/AppData/Local/Temp/nova-docs-90a94cb5/architecture-7.png" id="52" name="Picture"/>
+                    <pic:cNvPr descr="C:/Users/laxmi/AppData/Local/Temp/nova-docs-29bc2e55/architecture-7.png" id="52" name="Picture"/>
                     <pic:cNvPicPr>
                       <a:picLocks noChangeArrowheads="1" noChangeAspect="1"/>
                     </pic:cNvPicPr>
@@ -3762,7 +3762,7 @@
               <a:graphicData uri="http://schemas.openxmlformats.org/drawingml/2006/picture">
                 <pic:pic>
                   <pic:nvPicPr>
-                    <pic:cNvPr descr="C:/Users/laxmi/AppData/Local/Temp/nova-docs-90a94cb5/architecture-8.png" id="57" name="Picture"/>
+                    <pic:cNvPr descr="C:/Users/laxmi/AppData/Local/Temp/nova-docs-29bc2e55/architecture-8.png" id="57" name="Picture"/>
                     <pic:cNvPicPr>
                       <a:picLocks noChangeArrowheads="1" noChangeAspect="1"/>
                     </pic:cNvPicPr>
@@ -5049,7 +5049,7 @@
               <a:graphicData uri="http://schemas.openxmlformats.org/drawingml/2006/picture">
                 <pic:pic>
                   <pic:nvPicPr>
-                    <pic:cNvPr descr="C:/Users/laxmi/AppData/Local/Temp/nova-docs-90a94cb5/architecture-9.png" id="73" name="Picture"/>
+                    <pic:cNvPr descr="C:/Users/laxmi/AppData/Local/Temp/nova-docs-29bc2e55/architecture-9.png" id="73" name="Picture"/>
                     <pic:cNvPicPr>
                       <a:picLocks noChangeArrowheads="1" noChangeAspect="1"/>
                     </pic:cNvPicPr>

</xml_diff>

<commit_message>
Complete the model selection spike and pick gemma3:4b
Full run: 20 requirements x 5 candidates, 100 of 100 schema-valid.
gemma3:4b leads coverage at 2.9 GB and 17.3 s median. Both 8B candidates
need 6.6 GB, run about a third on CPU, and tie on quality, so R-08 closes
against them.

Closed risks keep their original id now - renaming them on closure broke
every reference.
</commit_message>
<xml_diff>
--- a/docs/dist/architecture.docx
+++ b/docs/dist/architecture.docx
@@ -117,7 +117,7 @@
               <w:pStyle w:val="Compact"/>
             </w:pPr>
             <w:r>
-              <w:t xml:space="preserve">0.2</w:t>
+              <w:t xml:space="preserve">0.3</w:t>
             </w:r>
           </w:p>
         </w:tc>
@@ -1543,7 +1543,7 @@
               <a:graphicData uri="http://schemas.openxmlformats.org/drawingml/2006/picture">
                 <pic:pic>
                   <pic:nvPicPr>
-                    <pic:cNvPr descr="C:/Users/laxmi/AppData/Local/Temp/nova-docs-7d75132e/architecture-1.png" id="17" name="Picture"/>
+                    <pic:cNvPr descr="C:/Users/laxmi/AppData/Local/Temp/nova-docs-a9995d3c/architecture-1.png" id="17" name="Picture"/>
                     <pic:cNvPicPr>
                       <a:picLocks noChangeArrowheads="1" noChangeAspect="1"/>
                     </pic:cNvPicPr>
@@ -2334,7 +2334,7 @@
               <a:graphicData uri="http://schemas.openxmlformats.org/drawingml/2006/picture">
                 <pic:pic>
                   <pic:nvPicPr>
-                    <pic:cNvPr descr="C:/Users/laxmi/AppData/Local/Temp/nova-docs-7d75132e/architecture-2.png" id="28" name="Picture"/>
+                    <pic:cNvPr descr="C:/Users/laxmi/AppData/Local/Temp/nova-docs-a9995d3c/architecture-2.png" id="28" name="Picture"/>
                     <pic:cNvPicPr>
                       <a:picLocks noChangeArrowheads="1" noChangeAspect="1"/>
                     </pic:cNvPicPr>
@@ -2391,7 +2391,7 @@
               <a:graphicData uri="http://schemas.openxmlformats.org/drawingml/2006/picture">
                 <pic:pic>
                   <pic:nvPicPr>
-                    <pic:cNvPr descr="C:/Users/laxmi/AppData/Local/Temp/nova-docs-7d75132e/architecture-3.png" id="32" name="Picture"/>
+                    <pic:cNvPr descr="C:/Users/laxmi/AppData/Local/Temp/nova-docs-a9995d3c/architecture-3.png" id="32" name="Picture"/>
                     <pic:cNvPicPr>
                       <a:picLocks noChangeArrowheads="1" noChangeAspect="1"/>
                     </pic:cNvPicPr>
@@ -2917,7 +2917,7 @@
               <a:graphicData uri="http://schemas.openxmlformats.org/drawingml/2006/picture">
                 <pic:pic>
                   <pic:nvPicPr>
-                    <pic:cNvPr descr="C:/Users/laxmi/AppData/Local/Temp/nova-docs-7d75132e/architecture-4.png" id="38" name="Picture"/>
+                    <pic:cNvPr descr="C:/Users/laxmi/AppData/Local/Temp/nova-docs-a9995d3c/architecture-4.png" id="38" name="Picture"/>
                     <pic:cNvPicPr>
                       <a:picLocks noChangeArrowheads="1" noChangeAspect="1"/>
                     </pic:cNvPicPr>
@@ -2974,7 +2974,7 @@
               <a:graphicData uri="http://schemas.openxmlformats.org/drawingml/2006/picture">
                 <pic:pic>
                   <pic:nvPicPr>
-                    <pic:cNvPr descr="C:/Users/laxmi/AppData/Local/Temp/nova-docs-7d75132e/architecture-5.png" id="42" name="Picture"/>
+                    <pic:cNvPr descr="C:/Users/laxmi/AppData/Local/Temp/nova-docs-a9995d3c/architecture-5.png" id="42" name="Picture"/>
                     <pic:cNvPicPr>
                       <a:picLocks noChangeArrowheads="1" noChangeAspect="1"/>
                     </pic:cNvPicPr>
@@ -3031,7 +3031,7 @@
               <a:graphicData uri="http://schemas.openxmlformats.org/drawingml/2006/picture">
                 <pic:pic>
                   <pic:nvPicPr>
-                    <pic:cNvPr descr="C:/Users/laxmi/AppData/Local/Temp/nova-docs-7d75132e/architecture-6.png" id="46" name="Picture"/>
+                    <pic:cNvPr descr="C:/Users/laxmi/AppData/Local/Temp/nova-docs-a9995d3c/architecture-6.png" id="46" name="Picture"/>
                     <pic:cNvPicPr>
                       <a:picLocks noChangeArrowheads="1" noChangeAspect="1"/>
                     </pic:cNvPicPr>
@@ -3394,7 +3394,7 @@
               <a:graphicData uri="http://schemas.openxmlformats.org/drawingml/2006/picture">
                 <pic:pic>
                   <pic:nvPicPr>
-                    <pic:cNvPr descr="C:/Users/laxmi/AppData/Local/Temp/nova-docs-7d75132e/architecture-7.png" id="52" name="Picture"/>
+                    <pic:cNvPr descr="C:/Users/laxmi/AppData/Local/Temp/nova-docs-a9995d3c/architecture-7.png" id="52" name="Picture"/>
                     <pic:cNvPicPr>
                       <a:picLocks noChangeArrowheads="1" noChangeAspect="1"/>
                     </pic:cNvPicPr>
@@ -3762,7 +3762,7 @@
               <a:graphicData uri="http://schemas.openxmlformats.org/drawingml/2006/picture">
                 <pic:pic>
                   <pic:nvPicPr>
-                    <pic:cNvPr descr="C:/Users/laxmi/AppData/Local/Temp/nova-docs-7d75132e/architecture-8.png" id="57" name="Picture"/>
+                    <pic:cNvPr descr="C:/Users/laxmi/AppData/Local/Temp/nova-docs-a9995d3c/architecture-8.png" id="57" name="Picture"/>
                     <pic:cNvPicPr>
                       <a:picLocks noChangeArrowheads="1" noChangeAspect="1"/>
                     </pic:cNvPicPr>
@@ -5093,7 +5093,7 @@
               <a:graphicData uri="http://schemas.openxmlformats.org/drawingml/2006/picture">
                 <pic:pic>
                   <pic:nvPicPr>
-                    <pic:cNvPr descr="C:/Users/laxmi/AppData/Local/Temp/nova-docs-7d75132e/architecture-9.png" id="73" name="Picture"/>
+                    <pic:cNvPr descr="C:/Users/laxmi/AppData/Local/Temp/nova-docs-a9995d3c/architecture-9.png" id="73" name="Picture"/>
                     <pic:cNvPicPr>
                       <a:picLocks noChangeArrowheads="1" noChangeAspect="1"/>
                     </pic:cNvPicPr>
@@ -5830,52 +5830,6 @@
               <w:pStyle w:val="Compact"/>
             </w:pPr>
             <w:r>
-              <w:t xml:space="preserve">R-08</w:t>
-            </w:r>
-          </w:p>
-        </w:tc>
-        <w:tc>
-          <w:tcPr/>
-          <w:p>
-            <w:pPr>
-              <w:pStyle w:val="Compact"/>
-            </w:pPr>
-            <w:r>
-              <w:t xml:space="preserve">The 8B model class may not fit the VRAM budget, and was not measured</w:t>
-            </w:r>
-          </w:p>
-        </w:tc>
-        <w:tc>
-          <w:tcPr/>
-          <w:p>
-            <w:pPr>
-              <w:pStyle w:val="Compact"/>
-            </w:pPr>
-            <w:r>
-              <w:t xml:space="preserve">Medium</w:t>
-            </w:r>
-          </w:p>
-        </w:tc>
-        <w:tc>
-          <w:tcPr/>
-          <w:p>
-            <w:pPr>
-              <w:pStyle w:val="Compact"/>
-            </w:pPr>
-            <w:r>
-              <w:t xml:space="preserve">Two candidates retrieved and awaiting measurement</w:t>
-            </w:r>
-          </w:p>
-        </w:tc>
-      </w:tr>
-      <w:tr>
-        <w:tc>
-          <w:tcPr/>
-          <w:p>
-            <w:pPr>
-              <w:pStyle w:val="Compact"/>
-            </w:pPr>
-            <w:r>
               <w:t xml:space="preserve">R-09</w:t>
             </w:r>
           </w:p>
@@ -6365,6 +6319,52 @@
             </w:pPr>
             <w:r>
               <w:t xml:space="preserve">Embedding dimension fixed at 768 in section 8.4. R-04 moved to closed</w:t>
+            </w:r>
+          </w:p>
+        </w:tc>
+      </w:tr>
+      <w:tr>
+        <w:tc>
+          <w:tcPr/>
+          <w:p>
+            <w:pPr>
+              <w:pStyle w:val="Compact"/>
+            </w:pPr>
+            <w:r>
+              <w:t xml:space="preserve">0.3</w:t>
+            </w:r>
+          </w:p>
+        </w:tc>
+        <w:tc>
+          <w:tcPr/>
+          <w:p>
+            <w:pPr>
+              <w:pStyle w:val="Compact"/>
+            </w:pPr>
+            <w:r>
+              <w:t xml:space="preserve">2026-09-08</w:t>
+            </w:r>
+          </w:p>
+        </w:tc>
+        <w:tc>
+          <w:tcPr/>
+          <w:p>
+            <w:pPr>
+              <w:pStyle w:val="Compact"/>
+            </w:pPr>
+            <w:r>
+              <w:t xml:space="preserve">Laxmi Poudel</w:t>
+            </w:r>
+          </w:p>
+        </w:tc>
+        <w:tc>
+          <w:tcPr/>
+          <w:p>
+            <w:pPr>
+              <w:pStyle w:val="Compact"/>
+            </w:pPr>
+            <w:r>
+              <w:t xml:space="preserve">R-08 moved to closed</w:t>
             </w:r>
           </w:p>
         </w:tc>

</xml_diff>

<commit_message>
Verify container-to-host reachability, closing G4
R-09 assumed a container couldn't reach a loopback-bound Ollama. It can:
host.docker.internal is Docker Desktop's own proxy, not a host interface, so
the inference API stays on 127.0.0.1 and the firewall rule the mitigation
called for isn't needed. Linux-native engines have no such proxy, so the
remediation stays in the script's failure message.

Fixed a correlated array_agg in the check script that failed on first run.
</commit_message>
<xml_diff>
--- a/docs/dist/architecture.docx
+++ b/docs/dist/architecture.docx
@@ -28,7 +28,7 @@
         </w:p>
       </w:sdtContent>
     </w:sdt>
-    <w:bookmarkStart w:id="82" w:name="software-architecture-document"/>
+    <w:bookmarkStart w:id="83" w:name="software-architecture-document"/>
     <w:p>
       <w:pPr>
         <w:pStyle w:val="Heading1"/>
@@ -1543,7 +1543,7 @@
               <a:graphicData uri="http://schemas.openxmlformats.org/drawingml/2006/picture">
                 <pic:pic>
                   <pic:nvPicPr>
-                    <pic:cNvPr descr="C:/Users/laxmi/AppData/Local/Temp/nova-docs-469f4695/architecture-1.png" id="17" name="Picture"/>
+                    <pic:cNvPr descr="C:/Users/laxmi/AppData/Local/Temp/nova-docs-9d5e1198/architecture-1.png" id="17" name="Picture"/>
                     <pic:cNvPicPr>
                       <a:picLocks noChangeArrowheads="1" noChangeAspect="1"/>
                     </pic:cNvPicPr>
@@ -2334,7 +2334,7 @@
               <a:graphicData uri="http://schemas.openxmlformats.org/drawingml/2006/picture">
                 <pic:pic>
                   <pic:nvPicPr>
-                    <pic:cNvPr descr="C:/Users/laxmi/AppData/Local/Temp/nova-docs-469f4695/architecture-2.png" id="28" name="Picture"/>
+                    <pic:cNvPr descr="C:/Users/laxmi/AppData/Local/Temp/nova-docs-9d5e1198/architecture-2.png" id="28" name="Picture"/>
                     <pic:cNvPicPr>
                       <a:picLocks noChangeArrowheads="1" noChangeAspect="1"/>
                     </pic:cNvPicPr>
@@ -2391,7 +2391,7 @@
               <a:graphicData uri="http://schemas.openxmlformats.org/drawingml/2006/picture">
                 <pic:pic>
                   <pic:nvPicPr>
-                    <pic:cNvPr descr="C:/Users/laxmi/AppData/Local/Temp/nova-docs-469f4695/architecture-3.png" id="32" name="Picture"/>
+                    <pic:cNvPr descr="C:/Users/laxmi/AppData/Local/Temp/nova-docs-9d5e1198/architecture-3.png" id="32" name="Picture"/>
                     <pic:cNvPicPr>
                       <a:picLocks noChangeArrowheads="1" noChangeAspect="1"/>
                     </pic:cNvPicPr>
@@ -2917,7 +2917,7 @@
               <a:graphicData uri="http://schemas.openxmlformats.org/drawingml/2006/picture">
                 <pic:pic>
                   <pic:nvPicPr>
-                    <pic:cNvPr descr="C:/Users/laxmi/AppData/Local/Temp/nova-docs-469f4695/architecture-4.png" id="38" name="Picture"/>
+                    <pic:cNvPr descr="C:/Users/laxmi/AppData/Local/Temp/nova-docs-9d5e1198/architecture-4.png" id="38" name="Picture"/>
                     <pic:cNvPicPr>
                       <a:picLocks noChangeArrowheads="1" noChangeAspect="1"/>
                     </pic:cNvPicPr>
@@ -2974,7 +2974,7 @@
               <a:graphicData uri="http://schemas.openxmlformats.org/drawingml/2006/picture">
                 <pic:pic>
                   <pic:nvPicPr>
-                    <pic:cNvPr descr="C:/Users/laxmi/AppData/Local/Temp/nova-docs-469f4695/architecture-5.png" id="42" name="Picture"/>
+                    <pic:cNvPr descr="C:/Users/laxmi/AppData/Local/Temp/nova-docs-9d5e1198/architecture-5.png" id="42" name="Picture"/>
                     <pic:cNvPicPr>
                       <a:picLocks noChangeArrowheads="1" noChangeAspect="1"/>
                     </pic:cNvPicPr>
@@ -3031,7 +3031,7 @@
               <a:graphicData uri="http://schemas.openxmlformats.org/drawingml/2006/picture">
                 <pic:pic>
                   <pic:nvPicPr>
-                    <pic:cNvPr descr="C:/Users/laxmi/AppData/Local/Temp/nova-docs-469f4695/architecture-6.png" id="46" name="Picture"/>
+                    <pic:cNvPr descr="C:/Users/laxmi/AppData/Local/Temp/nova-docs-9d5e1198/architecture-6.png" id="46" name="Picture"/>
                     <pic:cNvPicPr>
                       <a:picLocks noChangeArrowheads="1" noChangeAspect="1"/>
                     </pic:cNvPicPr>
@@ -3371,7 +3371,7 @@
     </w:tbl>
     <w:bookmarkEnd w:id="48"/>
     <w:bookmarkEnd w:id="49"/>
-    <w:bookmarkStart w:id="53" w:name="X8bd019142cf289fb6ec3c423b10ef40538825ab"/>
+    <w:bookmarkStart w:id="54" w:name="X8bd019142cf289fb6ec3c423b10ef40538825ab"/>
     <w:p>
       <w:pPr>
         <w:pStyle w:val="Heading2"/>
@@ -3394,7 +3394,7 @@
               <a:graphicData uri="http://schemas.openxmlformats.org/drawingml/2006/picture">
                 <pic:pic>
                   <pic:nvPicPr>
-                    <pic:cNvPr descr="C:/Users/laxmi/AppData/Local/Temp/nova-docs-469f4695/architecture-7.png" id="52" name="Picture"/>
+                    <pic:cNvPr descr="C:/Users/laxmi/AppData/Local/Temp/nova-docs-9d5e1198/architecture-7.png" id="52" name="Picture"/>
                     <pic:cNvPicPr>
                       <a:picLocks noChangeArrowheads="1" noChangeAspect="1"/>
                     </pic:cNvPicPr>
@@ -3531,14 +3531,55 @@
               <w:pStyle w:val="Compact"/>
             </w:pPr>
             <w:r>
-              <w:t xml:space="preserve">GPU passthrough on this platform adds operational friction without benefit. The container-to-host path requires verification and documentation, and is the most likely first-run obstacle for anyone cloning the repository</w:t>
-            </w:r>
+              <w:t xml:space="preserve">GPU passthrough on this platform adds operational friction without benefit. The container-to-host path is verified: on Docker Desktop,</w:t>
+            </w:r>
+            <w:r>
+              <w:t xml:space="preserve"> </w:t>
+            </w:r>
+            <w:r>
+              <w:rPr>
+                <w:rStyle w:val="VerbatimChar"/>
+              </w:rPr>
+              <w:t xml:space="preserve">host.docker.internal</w:t>
+            </w:r>
+            <w:r>
+              <w:t xml:space="preserve"> </w:t>
+            </w:r>
+            <w:r>
+              <w:t xml:space="preserve">reaches the runtime on its default loopback binding, so no host-side binding change is required. A Linux-native engine has no equivalent host proxy and needs</w:t>
+            </w:r>
+            <w:r>
+              <w:t xml:space="preserve"> </w:t>
+            </w:r>
+            <w:r>
+              <w:rPr>
+                <w:rStyle w:val="VerbatimChar"/>
+              </w:rPr>
+              <w:t xml:space="preserve">OLLAMA_HOST</w:t>
+            </w:r>
+            <w:r>
+              <w:t xml:space="preserve"> </w:t>
+            </w:r>
+            <w:r>
+              <w:t xml:space="preserve">widened with the port firewalled to the Docker subnet.</w:t>
+            </w:r>
+            <w:r>
+              <w:t xml:space="preserve"> </w:t>
+            </w:r>
+            <w:hyperlink r:id="rId53">
+              <w:r>
+                <w:rPr>
+                  <w:rStyle w:val="Hyperlink"/>
+                </w:rPr>
+                <w:t xml:space="preserve">NOVA-SPK-003</w:t>
+              </w:r>
+            </w:hyperlink>
           </w:p>
         </w:tc>
       </w:tr>
     </w:tbl>
-    <w:bookmarkEnd w:id="53"/>
-    <w:bookmarkStart w:id="68" w:name="Xe161720d8f173dc806f57bcf779f8cec5fd411d"/>
+    <w:bookmarkEnd w:id="54"/>
+    <w:bookmarkStart w:id="69" w:name="Xe161720d8f173dc806f57bcf779f8cec5fd411d"/>
     <w:p>
       <w:pPr>
         <w:pStyle w:val="Heading2"/>
@@ -3547,7 +3588,7 @@
         <w:t xml:space="preserve">8. Crosscutting concepts</w:t>
       </w:r>
     </w:p>
-    <w:bookmarkStart w:id="54" w:name="X78d6bf23f72e8c8b9b53bbe0f221220dce841ba"/>
+    <w:bookmarkStart w:id="55" w:name="X78d6bf23f72e8c8b9b53bbe0f221220dce841ba"/>
     <w:p>
       <w:pPr>
         <w:pStyle w:val="Heading3"/>
@@ -3738,8 +3779,8 @@
         </w:tc>
       </w:tr>
     </w:tbl>
-    <w:bookmarkEnd w:id="54"/>
-    <w:bookmarkStart w:id="59" w:name="X54ab6905bea0077cc6b51fa8507759d330d7de3"/>
+    <w:bookmarkEnd w:id="55"/>
+    <w:bookmarkStart w:id="60" w:name="X54ab6905bea0077cc6b51fa8507759d330d7de3"/>
     <w:p>
       <w:pPr>
         <w:pStyle w:val="Heading3"/>
@@ -3757,18 +3798,18 @@
           <wp:inline>
             <wp:extent cx="5943600" cy="1515961"/>
             <wp:effectExtent b="0" l="0" r="0" t="0"/>
-            <wp:docPr descr="" title="" id="56" name="Picture"/>
+            <wp:docPr descr="" title="" id="57" name="Picture"/>
             <a:graphic>
               <a:graphicData uri="http://schemas.openxmlformats.org/drawingml/2006/picture">
                 <pic:pic>
                   <pic:nvPicPr>
-                    <pic:cNvPr descr="C:/Users/laxmi/AppData/Local/Temp/nova-docs-469f4695/architecture-8.png" id="57" name="Picture"/>
+                    <pic:cNvPr descr="C:/Users/laxmi/AppData/Local/Temp/nova-docs-9d5e1198/architecture-8.png" id="58" name="Picture"/>
                     <pic:cNvPicPr>
                       <a:picLocks noChangeArrowheads="1" noChangeAspect="1"/>
                     </pic:cNvPicPr>
                   </pic:nvPicPr>
                   <pic:blipFill>
-                    <a:blip r:embed="rId55"/>
+                    <a:blip r:embed="rId56"/>
                     <a:stretch>
                       <a:fillRect/>
                     </a:stretch>
@@ -3851,7 +3892,7 @@
       <w:r>
         <w:t xml:space="preserve"> </w:t>
       </w:r>
-      <w:hyperlink r:id="rId58">
+      <w:hyperlink r:id="rId59">
         <w:r>
           <w:rPr>
             <w:rStyle w:val="Hyperlink"/>
@@ -3863,8 +3904,8 @@
         <w:t xml:space="preserve">.</w:t>
       </w:r>
     </w:p>
-    <w:bookmarkEnd w:id="59"/>
-    <w:bookmarkStart w:id="60" w:name="X613afa6fb932031f616a7d7ddc82a7fff03f0d1"/>
+    <w:bookmarkEnd w:id="60"/>
+    <w:bookmarkStart w:id="61" w:name="X613afa6fb932031f616a7d7ddc82a7fff03f0d1"/>
     <w:p>
       <w:pPr>
         <w:pStyle w:val="Heading3"/>
@@ -4464,8 +4505,8 @@
         <w:t xml:space="preserve">log. A poisoning incident or a change to the weighting scheme is therefore recoverable.</w:t>
       </w:r>
     </w:p>
-    <w:bookmarkEnd w:id="60"/>
-    <w:bookmarkStart w:id="62" w:name="Xe53e7bf73c01a3b5d6f06dc6e031dcb1e10772f"/>
+    <w:bookmarkEnd w:id="61"/>
+    <w:bookmarkStart w:id="63" w:name="Xe53e7bf73c01a3b5d6f06dc6e031dcb1e10772f"/>
     <w:p>
       <w:pPr>
         <w:pStyle w:val="Heading3"/>
@@ -4549,7 +4590,7 @@
       <w:r>
         <w:t xml:space="preserve"> </w:t>
       </w:r>
-      <w:hyperlink r:id="rId61">
+      <w:hyperlink r:id="rId62">
         <w:r>
           <w:rPr>
             <w:rStyle w:val="Hyperlink"/>
@@ -4570,8 +4611,8 @@
         <w:t xml:space="preserve">evidence in NOVA-SPK-002.</w:t>
       </w:r>
     </w:p>
-    <w:bookmarkEnd w:id="62"/>
-    <w:bookmarkStart w:id="63" w:name="X7c3202f2996dec89269bd78dc47bf3bf916604e"/>
+    <w:bookmarkEnd w:id="63"/>
+    <w:bookmarkStart w:id="64" w:name="X7c3202f2996dec89269bd78dc47bf3bf916604e"/>
     <w:p>
       <w:pPr>
         <w:pStyle w:val="Heading3"/>
@@ -4615,8 +4656,8 @@
         <w:t xml:space="preserve">without its job. Diagnosis of a stalled job is a query rather than an operational investigation.</w:t>
       </w:r>
     </w:p>
-    <w:bookmarkEnd w:id="63"/>
-    <w:bookmarkStart w:id="64" w:name="Xddafc9ad46dc74e5ac7dc04087102cb1f819d05"/>
+    <w:bookmarkEnd w:id="64"/>
+    <w:bookmarkStart w:id="65" w:name="Xddafc9ad46dc74e5ac7dc04087102cb1f819d05"/>
     <w:p>
       <w:pPr>
         <w:pStyle w:val="Heading3"/>
@@ -4653,8 +4694,8 @@
         <w:t xml:space="preserve">selection and retrieval results.</w:t>
       </w:r>
     </w:p>
-    <w:bookmarkEnd w:id="64"/>
-    <w:bookmarkStart w:id="65" w:name="Xf9d0b37f5a678074537481b80cd54dc191d53c9"/>
+    <w:bookmarkEnd w:id="65"/>
+    <w:bookmarkStart w:id="66" w:name="Xf9d0b37f5a678074537481b80cd54dc191d53c9"/>
     <w:p>
       <w:pPr>
         <w:pStyle w:val="Heading3"/>
@@ -4703,8 +4744,8 @@
         <w:t xml:space="preserve">are the most probable route by which it would be undermined.</w:t>
       </w:r>
     </w:p>
-    <w:bookmarkEnd w:id="65"/>
-    <w:bookmarkStart w:id="66" w:name="X59575d66f95af07a9e4da5106f2f0f30ba5dff0"/>
+    <w:bookmarkEnd w:id="66"/>
+    <w:bookmarkStart w:id="67" w:name="X59575d66f95af07a9e4da5106f2f0f30ba5dff0"/>
     <w:p>
       <w:pPr>
         <w:pStyle w:val="Heading3"/>
@@ -4747,8 +4788,8 @@
         <w:t xml:space="preserve">results are uninterpretable and regression comparison is meaningless.</w:t>
       </w:r>
     </w:p>
-    <w:bookmarkEnd w:id="66"/>
-    <w:bookmarkStart w:id="67" w:name="X64ec02dc60f3d81da6b07a9685c839f7260380c"/>
+    <w:bookmarkEnd w:id="67"/>
+    <w:bookmarkStart w:id="68" w:name="X64ec02dc60f3d81da6b07a9685c839f7260380c"/>
     <w:p>
       <w:pPr>
         <w:pStyle w:val="Heading3"/>
@@ -4777,9 +4818,9 @@
         <w:t xml:space="preserve">evaluation layer's concern. Both provider implementations satisfy a shared contract suite.</w:t>
       </w:r>
     </w:p>
-    <w:bookmarkEnd w:id="67"/>
     <w:bookmarkEnd w:id="68"/>
-    <w:bookmarkStart w:id="70" w:name="Xcc5692e33ab3fc93d2ddf24b8d4e82b5b863139"/>
+    <w:bookmarkEnd w:id="69"/>
+    <w:bookmarkStart w:id="71" w:name="Xcc5692e33ab3fc93d2ddf24b8d4e82b5b863139"/>
     <w:p>
       <w:pPr>
         <w:pStyle w:val="Heading2"/>
@@ -4798,7 +4839,7 @@
       <w:r>
         <w:t xml:space="preserve"> </w:t>
       </w:r>
-      <w:hyperlink r:id="rId69">
+      <w:hyperlink r:id="rId70">
         <w:r>
           <w:rPr>
             <w:rStyle w:val="Hyperlink"/>
@@ -5026,7 +5067,7 @@
             <w:pPr>
               <w:pStyle w:val="Compact"/>
             </w:pPr>
-            <w:hyperlink r:id="rId61">
+            <w:hyperlink r:id="rId62">
               <w:r>
                 <w:rPr>
                   <w:rStyle w:val="Hyperlink"/>
@@ -5060,8 +5101,8 @@
         </w:tc>
       </w:tr>
     </w:tbl>
-    <w:bookmarkEnd w:id="70"/>
-    <w:bookmarkStart w:id="76" w:name="X0e95e9cc01008fd85211210bb98668ff898672b"/>
+    <w:bookmarkEnd w:id="71"/>
+    <w:bookmarkStart w:id="77" w:name="X0e95e9cc01008fd85211210bb98668ff898672b"/>
     <w:p>
       <w:pPr>
         <w:pStyle w:val="Heading2"/>
@@ -5070,7 +5111,7 @@
         <w:t xml:space="preserve">10. Quality requirements</w:t>
       </w:r>
     </w:p>
-    <w:bookmarkStart w:id="74" w:name="X811c158ed678f7c7313f13ff0d33514deb126df"/>
+    <w:bookmarkStart w:id="75" w:name="X811c158ed678f7c7313f13ff0d33514deb126df"/>
     <w:p>
       <w:pPr>
         <w:pStyle w:val="Heading3"/>
@@ -5088,18 +5129,18 @@
           <wp:inline>
             <wp:extent cx="5943600" cy="9628440"/>
             <wp:effectExtent b="0" l="0" r="0" t="0"/>
-            <wp:docPr descr="" title="" id="72" name="Picture"/>
+            <wp:docPr descr="" title="" id="73" name="Picture"/>
             <a:graphic>
               <a:graphicData uri="http://schemas.openxmlformats.org/drawingml/2006/picture">
                 <pic:pic>
                   <pic:nvPicPr>
-                    <pic:cNvPr descr="C:/Users/laxmi/AppData/Local/Temp/nova-docs-469f4695/architecture-9.png" id="73" name="Picture"/>
+                    <pic:cNvPr descr="C:/Users/laxmi/AppData/Local/Temp/nova-docs-9d5e1198/architecture-9.png" id="74" name="Picture"/>
                     <pic:cNvPicPr>
                       <a:picLocks noChangeArrowheads="1" noChangeAspect="1"/>
                     </pic:cNvPicPr>
                   </pic:nvPicPr>
                   <pic:blipFill>
-                    <a:blip r:embed="rId71"/>
+                    <a:blip r:embed="rId72"/>
                     <a:stretch>
                       <a:fillRect/>
                     </a:stretch>
@@ -5126,8 +5167,8 @@
         </w:drawing>
       </w:r>
     </w:p>
-    <w:bookmarkEnd w:id="74"/>
-    <w:bookmarkStart w:id="75" w:name="X53ea30c64f45e23e8d1e8449f595c20cc065ece"/>
+    <w:bookmarkEnd w:id="75"/>
+    <w:bookmarkStart w:id="76" w:name="X53ea30c64f45e23e8d1e8449f595c20cc065ece"/>
     <w:p>
       <w:pPr>
         <w:pStyle w:val="Heading3"/>
@@ -5612,9 +5653,9 @@
         </w:tc>
       </w:tr>
     </w:tbl>
-    <w:bookmarkEnd w:id="75"/>
     <w:bookmarkEnd w:id="76"/>
-    <w:bookmarkStart w:id="78" w:name="X7a1ea36a35f71b8e1640e72d2b209f06fccbf28"/>
+    <w:bookmarkEnd w:id="77"/>
+    <w:bookmarkStart w:id="79" w:name="X7a1ea36a35f71b8e1640e72d2b209f06fccbf28"/>
     <w:p>
       <w:pPr>
         <w:pStyle w:val="Heading2"/>
@@ -5830,6 +5871,9 @@
               <w:pStyle w:val="Compact"/>
             </w:pPr>
             <w:r>
+              <w:rPr>
+                <w:strike/>
+              </w:rPr>
               <w:t xml:space="preserve">R-09</w:t>
             </w:r>
           </w:p>
@@ -5841,6 +5885,9 @@
               <w:pStyle w:val="Compact"/>
             </w:pPr>
             <w:r>
+              <w:rPr>
+                <w:strike/>
+              </w:rPr>
               <w:t xml:space="preserve">Container-to-host inference reachability is unverified on this platform</w:t>
             </w:r>
           </w:p>
@@ -5852,6 +5899,73 @@
               <w:pStyle w:val="Compact"/>
             </w:pPr>
             <w:r>
+              <w:t xml:space="preserve">Closed</w:t>
+            </w:r>
+          </w:p>
+        </w:tc>
+        <w:tc>
+          <w:tcPr/>
+          <w:p>
+            <w:pPr>
+              <w:pStyle w:val="Compact"/>
+            </w:pPr>
+            <w:r>
+              <w:rPr>
+                <w:b/>
+                <w:bCs/>
+              </w:rPr>
+              <w:t xml:space="preserve">Resolved 2026-09-09.</w:t>
+            </w:r>
+            <w:r>
+              <w:t xml:space="preserve"> </w:t>
+            </w:r>
+            <w:r>
+              <w:t xml:space="preserve">Reachable with the inference runtime on its default loopback binding, through Docker Desktop's host proxy.</w:t>
+            </w:r>
+            <w:r>
+              <w:t xml:space="preserve"> </w:t>
+            </w:r>
+            <w:hyperlink r:id="rId53">
+              <w:r>
+                <w:rPr>
+                  <w:rStyle w:val="Hyperlink"/>
+                </w:rPr>
+                <w:t xml:space="preserve">NOVA-SPK-003</w:t>
+              </w:r>
+            </w:hyperlink>
+          </w:p>
+        </w:tc>
+      </w:tr>
+      <w:tr>
+        <w:tc>
+          <w:tcPr/>
+          <w:p>
+            <w:pPr>
+              <w:pStyle w:val="Compact"/>
+            </w:pPr>
+            <w:r>
+              <w:t xml:space="preserve">R-11</w:t>
+            </w:r>
+          </w:p>
+        </w:tc>
+        <w:tc>
+          <w:tcPr/>
+          <w:p>
+            <w:pPr>
+              <w:pStyle w:val="Compact"/>
+            </w:pPr>
+            <w:r>
+              <w:t xml:space="preserve">Persistent injection defences are unproven</w:t>
+            </w:r>
+          </w:p>
+        </w:tc>
+        <w:tc>
+          <w:tcPr/>
+          <w:p>
+            <w:pPr>
+              <w:pStyle w:val="Compact"/>
+            </w:pPr>
+            <w:r>
               <w:t xml:space="preserve">Medium</w:t>
             </w:r>
           </w:p>
@@ -5863,52 +5977,6 @@
               <w:pStyle w:val="Compact"/>
             </w:pPr>
             <w:r>
-              <w:t xml:space="preserve">Verified before deployment work. Resolution documented</w:t>
-            </w:r>
-          </w:p>
-        </w:tc>
-      </w:tr>
-      <w:tr>
-        <w:tc>
-          <w:tcPr/>
-          <w:p>
-            <w:pPr>
-              <w:pStyle w:val="Compact"/>
-            </w:pPr>
-            <w:r>
-              <w:t xml:space="preserve">R-11</w:t>
-            </w:r>
-          </w:p>
-        </w:tc>
-        <w:tc>
-          <w:tcPr/>
-          <w:p>
-            <w:pPr>
-              <w:pStyle w:val="Compact"/>
-            </w:pPr>
-            <w:r>
-              <w:t xml:space="preserve">Persistent injection defences are unproven</w:t>
-            </w:r>
-          </w:p>
-        </w:tc>
-        <w:tc>
-          <w:tcPr/>
-          <w:p>
-            <w:pPr>
-              <w:pStyle w:val="Compact"/>
-            </w:pPr>
-            <w:r>
-              <w:t xml:space="preserve">Medium</w:t>
-            </w:r>
-          </w:p>
-        </w:tc>
-        <w:tc>
-          <w:tcPr/>
-          <w:p>
-            <w:pPr>
-              <w:pStyle w:val="Compact"/>
-            </w:pPr>
-            <w:r>
               <w:t xml:space="preserve">The adversarial suite establishes a floor, not a guarantee, and is described as such</w:t>
             </w:r>
           </w:p>
@@ -6109,7 +6177,7 @@
       <w:r>
         <w:t xml:space="preserve"> </w:t>
       </w:r>
-      <w:hyperlink r:id="rId77">
+      <w:hyperlink r:id="rId78">
         <w:r>
           <w:rPr>
             <w:rStyle w:val="Hyperlink"/>
@@ -6121,8 +6189,8 @@
         <w:t xml:space="preserve">.</w:t>
       </w:r>
     </w:p>
-    <w:bookmarkEnd w:id="78"/>
-    <w:bookmarkStart w:id="80" w:name="X3d29c9c930e7bea12d62a5482ba454eaf942e6b"/>
+    <w:bookmarkEnd w:id="79"/>
+    <w:bookmarkStart w:id="81" w:name="X3d29c9c930e7bea12d62a5482ba454eaf942e6b"/>
     <w:p>
       <w:pPr>
         <w:pStyle w:val="Heading2"/>
@@ -6141,7 +6209,7 @@
       <w:r>
         <w:t xml:space="preserve"> </w:t>
       </w:r>
-      <w:hyperlink r:id="rId79">
+      <w:hyperlink r:id="rId80">
         <w:r>
           <w:rPr>
             <w:rStyle w:val="Hyperlink"/>
@@ -6160,8 +6228,8 @@
         </w:pict>
       </w:r>
     </w:p>
-    <w:bookmarkEnd w:id="80"/>
-    <w:bookmarkStart w:id="81" w:name="revision-history"/>
+    <w:bookmarkEnd w:id="81"/>
+    <w:bookmarkStart w:id="82" w:name="revision-history"/>
     <w:p>
       <w:pPr>
         <w:pStyle w:val="Heading2"/>
@@ -6369,9 +6437,55 @@
           </w:p>
         </w:tc>
       </w:tr>
+      <w:tr>
+        <w:tc>
+          <w:tcPr/>
+          <w:p>
+            <w:pPr>
+              <w:pStyle w:val="Compact"/>
+            </w:pPr>
+            <w:r>
+              <w:t xml:space="preserve">0.4</w:t>
+            </w:r>
+          </w:p>
+        </w:tc>
+        <w:tc>
+          <w:tcPr/>
+          <w:p>
+            <w:pPr>
+              <w:pStyle w:val="Compact"/>
+            </w:pPr>
+            <w:r>
+              <w:t xml:space="preserve">2026-09-09</w:t>
+            </w:r>
+          </w:p>
+        </w:tc>
+        <w:tc>
+          <w:tcPr/>
+          <w:p>
+            <w:pPr>
+              <w:pStyle w:val="Compact"/>
+            </w:pPr>
+            <w:r>
+              <w:t xml:space="preserve">Laxmi Poudel</w:t>
+            </w:r>
+          </w:p>
+        </w:tc>
+        <w:tc>
+          <w:tcPr/>
+          <w:p>
+            <w:pPr>
+              <w:pStyle w:val="Compact"/>
+            </w:pPr>
+            <w:r>
+              <w:t xml:space="preserve">R-09 moved to closed. Section 7 records the verified container-to-host path and the Linux-engine caveat</w:t>
+            </w:r>
+          </w:p>
+        </w:tc>
+      </w:tr>
     </w:tbl>
-    <w:bookmarkEnd w:id="81"/>
     <w:bookmarkEnd w:id="82"/>
+    <w:bookmarkEnd w:id="83"/>
     <w:sectPr>
       <w:footnotePr>
         <w:numRestart w:val="eachSect"/>

</xml_diff>

<commit_message>
Add the deployment composition for the datastore
Digest-pinned pgvector on a named volume, bound to loopback, healthchecked.
Defaults work with no .env so NFR-32 stays one command.

api, worker and web are left out until their code exists. A service block
pointing at a missing Dockerfile breaks the one command this file provides.
</commit_message>
<xml_diff>
--- a/docs/dist/architecture.docx
+++ b/docs/dist/architecture.docx
@@ -1543,7 +1543,7 @@
               <a:graphicData uri="http://schemas.openxmlformats.org/drawingml/2006/picture">
                 <pic:pic>
                   <pic:nvPicPr>
-                    <pic:cNvPr descr="C:/Users/laxmi/AppData/Local/Temp/nova-docs-9d5e1198/architecture-1.png" id="17" name="Picture"/>
+                    <pic:cNvPr descr="C:/Users/laxmi/AppData/Local/Temp/nova-docs-458a248a/architecture-1.png" id="17" name="Picture"/>
                     <pic:cNvPicPr>
                       <a:picLocks noChangeArrowheads="1" noChangeAspect="1"/>
                     </pic:cNvPicPr>
@@ -2334,7 +2334,7 @@
               <a:graphicData uri="http://schemas.openxmlformats.org/drawingml/2006/picture">
                 <pic:pic>
                   <pic:nvPicPr>
-                    <pic:cNvPr descr="C:/Users/laxmi/AppData/Local/Temp/nova-docs-9d5e1198/architecture-2.png" id="28" name="Picture"/>
+                    <pic:cNvPr descr="C:/Users/laxmi/AppData/Local/Temp/nova-docs-458a248a/architecture-2.png" id="28" name="Picture"/>
                     <pic:cNvPicPr>
                       <a:picLocks noChangeArrowheads="1" noChangeAspect="1"/>
                     </pic:cNvPicPr>
@@ -2391,7 +2391,7 @@
               <a:graphicData uri="http://schemas.openxmlformats.org/drawingml/2006/picture">
                 <pic:pic>
                   <pic:nvPicPr>
-                    <pic:cNvPr descr="C:/Users/laxmi/AppData/Local/Temp/nova-docs-9d5e1198/architecture-3.png" id="32" name="Picture"/>
+                    <pic:cNvPr descr="C:/Users/laxmi/AppData/Local/Temp/nova-docs-458a248a/architecture-3.png" id="32" name="Picture"/>
                     <pic:cNvPicPr>
                       <a:picLocks noChangeArrowheads="1" noChangeAspect="1"/>
                     </pic:cNvPicPr>
@@ -2917,7 +2917,7 @@
               <a:graphicData uri="http://schemas.openxmlformats.org/drawingml/2006/picture">
                 <pic:pic>
                   <pic:nvPicPr>
-                    <pic:cNvPr descr="C:/Users/laxmi/AppData/Local/Temp/nova-docs-9d5e1198/architecture-4.png" id="38" name="Picture"/>
+                    <pic:cNvPr descr="C:/Users/laxmi/AppData/Local/Temp/nova-docs-458a248a/architecture-4.png" id="38" name="Picture"/>
                     <pic:cNvPicPr>
                       <a:picLocks noChangeArrowheads="1" noChangeAspect="1"/>
                     </pic:cNvPicPr>
@@ -2974,7 +2974,7 @@
               <a:graphicData uri="http://schemas.openxmlformats.org/drawingml/2006/picture">
                 <pic:pic>
                   <pic:nvPicPr>
-                    <pic:cNvPr descr="C:/Users/laxmi/AppData/Local/Temp/nova-docs-9d5e1198/architecture-5.png" id="42" name="Picture"/>
+                    <pic:cNvPr descr="C:/Users/laxmi/AppData/Local/Temp/nova-docs-458a248a/architecture-5.png" id="42" name="Picture"/>
                     <pic:cNvPicPr>
                       <a:picLocks noChangeArrowheads="1" noChangeAspect="1"/>
                     </pic:cNvPicPr>
@@ -3031,7 +3031,7 @@
               <a:graphicData uri="http://schemas.openxmlformats.org/drawingml/2006/picture">
                 <pic:pic>
                   <pic:nvPicPr>
-                    <pic:cNvPr descr="C:/Users/laxmi/AppData/Local/Temp/nova-docs-9d5e1198/architecture-6.png" id="46" name="Picture"/>
+                    <pic:cNvPr descr="C:/Users/laxmi/AppData/Local/Temp/nova-docs-458a248a/architecture-6.png" id="46" name="Picture"/>
                     <pic:cNvPicPr>
                       <a:picLocks noChangeArrowheads="1" noChangeAspect="1"/>
                     </pic:cNvPicPr>
@@ -3394,7 +3394,7 @@
               <a:graphicData uri="http://schemas.openxmlformats.org/drawingml/2006/picture">
                 <pic:pic>
                   <pic:nvPicPr>
-                    <pic:cNvPr descr="C:/Users/laxmi/AppData/Local/Temp/nova-docs-9d5e1198/architecture-7.png" id="52" name="Picture"/>
+                    <pic:cNvPr descr="C:/Users/laxmi/AppData/Local/Temp/nova-docs-458a248a/architecture-7.png" id="52" name="Picture"/>
                     <pic:cNvPicPr>
                       <a:picLocks noChangeArrowheads="1" noChangeAspect="1"/>
                     </pic:cNvPicPr>
@@ -3803,7 +3803,7 @@
               <a:graphicData uri="http://schemas.openxmlformats.org/drawingml/2006/picture">
                 <pic:pic>
                   <pic:nvPicPr>
-                    <pic:cNvPr descr="C:/Users/laxmi/AppData/Local/Temp/nova-docs-9d5e1198/architecture-8.png" id="58" name="Picture"/>
+                    <pic:cNvPr descr="C:/Users/laxmi/AppData/Local/Temp/nova-docs-458a248a/architecture-8.png" id="58" name="Picture"/>
                     <pic:cNvPicPr>
                       <a:picLocks noChangeArrowheads="1" noChangeAspect="1"/>
                     </pic:cNvPicPr>
@@ -5134,7 +5134,7 @@
               <a:graphicData uri="http://schemas.openxmlformats.org/drawingml/2006/picture">
                 <pic:pic>
                   <pic:nvPicPr>
-                    <pic:cNvPr descr="C:/Users/laxmi/AppData/Local/Temp/nova-docs-9d5e1198/architecture-9.png" id="74" name="Picture"/>
+                    <pic:cNvPr descr="C:/Users/laxmi/AppData/Local/Temp/nova-docs-458a248a/architecture-9.png" id="74" name="Picture"/>
                     <pic:cNvPicPr>
                       <a:picLocks noChangeArrowheads="1" noChangeAspect="1"/>
                     </pic:cNvPicPr>

</xml_diff>

<commit_message>
Add forward-only migrations and the baseline schema
Runner is about 60 lines over psycopg rather than Alembic: forward-only
means no downgrade path, which is most of what a migration framework sells.
Applied files are checksummed, so editing one after it ran is an error
instead of a silent divergence.

Baseline is the vector extension plus the tenant table, per CON-7.
Everything else lands with the code that reads it.

Also fixed a stale threat-model note that still called the container-to-host
path unverified.
</commit_message>
<xml_diff>
--- a/docs/dist/architecture.docx
+++ b/docs/dist/architecture.docx
@@ -1543,7 +1543,7 @@
               <a:graphicData uri="http://schemas.openxmlformats.org/drawingml/2006/picture">
                 <pic:pic>
                   <pic:nvPicPr>
-                    <pic:cNvPr descr="C:/Users/laxmi/AppData/Local/Temp/nova-docs-458a248a/architecture-1.png" id="17" name="Picture"/>
+                    <pic:cNvPr descr="C:/Users/laxmi/AppData/Local/Temp/nova-docs-220cb107/architecture-1.png" id="17" name="Picture"/>
                     <pic:cNvPicPr>
                       <a:picLocks noChangeArrowheads="1" noChangeAspect="1"/>
                     </pic:cNvPicPr>
@@ -2334,7 +2334,7 @@
               <a:graphicData uri="http://schemas.openxmlformats.org/drawingml/2006/picture">
                 <pic:pic>
                   <pic:nvPicPr>
-                    <pic:cNvPr descr="C:/Users/laxmi/AppData/Local/Temp/nova-docs-458a248a/architecture-2.png" id="28" name="Picture"/>
+                    <pic:cNvPr descr="C:/Users/laxmi/AppData/Local/Temp/nova-docs-220cb107/architecture-2.png" id="28" name="Picture"/>
                     <pic:cNvPicPr>
                       <a:picLocks noChangeArrowheads="1" noChangeAspect="1"/>
                     </pic:cNvPicPr>
@@ -2391,7 +2391,7 @@
               <a:graphicData uri="http://schemas.openxmlformats.org/drawingml/2006/picture">
                 <pic:pic>
                   <pic:nvPicPr>
-                    <pic:cNvPr descr="C:/Users/laxmi/AppData/Local/Temp/nova-docs-458a248a/architecture-3.png" id="32" name="Picture"/>
+                    <pic:cNvPr descr="C:/Users/laxmi/AppData/Local/Temp/nova-docs-220cb107/architecture-3.png" id="32" name="Picture"/>
                     <pic:cNvPicPr>
                       <a:picLocks noChangeArrowheads="1" noChangeAspect="1"/>
                     </pic:cNvPicPr>
@@ -2917,7 +2917,7 @@
               <a:graphicData uri="http://schemas.openxmlformats.org/drawingml/2006/picture">
                 <pic:pic>
                   <pic:nvPicPr>
-                    <pic:cNvPr descr="C:/Users/laxmi/AppData/Local/Temp/nova-docs-458a248a/architecture-4.png" id="38" name="Picture"/>
+                    <pic:cNvPr descr="C:/Users/laxmi/AppData/Local/Temp/nova-docs-220cb107/architecture-4.png" id="38" name="Picture"/>
                     <pic:cNvPicPr>
                       <a:picLocks noChangeArrowheads="1" noChangeAspect="1"/>
                     </pic:cNvPicPr>
@@ -2974,7 +2974,7 @@
               <a:graphicData uri="http://schemas.openxmlformats.org/drawingml/2006/picture">
                 <pic:pic>
                   <pic:nvPicPr>
-                    <pic:cNvPr descr="C:/Users/laxmi/AppData/Local/Temp/nova-docs-458a248a/architecture-5.png" id="42" name="Picture"/>
+                    <pic:cNvPr descr="C:/Users/laxmi/AppData/Local/Temp/nova-docs-220cb107/architecture-5.png" id="42" name="Picture"/>
                     <pic:cNvPicPr>
                       <a:picLocks noChangeArrowheads="1" noChangeAspect="1"/>
                     </pic:cNvPicPr>
@@ -3031,7 +3031,7 @@
               <a:graphicData uri="http://schemas.openxmlformats.org/drawingml/2006/picture">
                 <pic:pic>
                   <pic:nvPicPr>
-                    <pic:cNvPr descr="C:/Users/laxmi/AppData/Local/Temp/nova-docs-458a248a/architecture-6.png" id="46" name="Picture"/>
+                    <pic:cNvPr descr="C:/Users/laxmi/AppData/Local/Temp/nova-docs-220cb107/architecture-6.png" id="46" name="Picture"/>
                     <pic:cNvPicPr>
                       <a:picLocks noChangeArrowheads="1" noChangeAspect="1"/>
                     </pic:cNvPicPr>
@@ -3394,7 +3394,7 @@
               <a:graphicData uri="http://schemas.openxmlformats.org/drawingml/2006/picture">
                 <pic:pic>
                   <pic:nvPicPr>
-                    <pic:cNvPr descr="C:/Users/laxmi/AppData/Local/Temp/nova-docs-458a248a/architecture-7.png" id="52" name="Picture"/>
+                    <pic:cNvPr descr="C:/Users/laxmi/AppData/Local/Temp/nova-docs-220cb107/architecture-7.png" id="52" name="Picture"/>
                     <pic:cNvPicPr>
                       <a:picLocks noChangeArrowheads="1" noChangeAspect="1"/>
                     </pic:cNvPicPr>
@@ -3803,7 +3803,7 @@
               <a:graphicData uri="http://schemas.openxmlformats.org/drawingml/2006/picture">
                 <pic:pic>
                   <pic:nvPicPr>
-                    <pic:cNvPr descr="C:/Users/laxmi/AppData/Local/Temp/nova-docs-458a248a/architecture-8.png" id="58" name="Picture"/>
+                    <pic:cNvPr descr="C:/Users/laxmi/AppData/Local/Temp/nova-docs-220cb107/architecture-8.png" id="58" name="Picture"/>
                     <pic:cNvPicPr>
                       <a:picLocks noChangeArrowheads="1" noChangeAspect="1"/>
                     </pic:cNvPicPr>
@@ -5134,7 +5134,7 @@
               <a:graphicData uri="http://schemas.openxmlformats.org/drawingml/2006/picture">
                 <pic:pic>
                   <pic:nvPicPr>
-                    <pic:cNvPr descr="C:/Users/laxmi/AppData/Local/Temp/nova-docs-458a248a/architecture-9.png" id="74" name="Picture"/>
+                    <pic:cNvPr descr="C:/Users/laxmi/AppData/Local/Temp/nova-docs-220cb107/architecture-9.png" id="74" name="Picture"/>
                     <pic:cNvPicPr>
                       <a:picLocks noChangeArrowheads="1" noChangeAspect="1"/>
                     </pic:cNvPicPr>

</xml_diff>

<commit_message>
Add the inference gateway with local and fake providers
Three operations over urllib, no HTTP client dependency. No retries here:
the orchestrator owns repair attempts and has to count them (FR-2.2,
FR-2.3), so a retry hidden in the gateway would be invisible to the
validity metric.

Unreachable runtime raises instead of falling back to the fake, and the
embedding length is checked against 768 rather than trusted. Both would
fail quietly otherwise.
</commit_message>
<xml_diff>
--- a/docs/dist/architecture.docx
+++ b/docs/dist/architecture.docx
@@ -1543,7 +1543,7 @@
               <a:graphicData uri="http://schemas.openxmlformats.org/drawingml/2006/picture">
                 <pic:pic>
                   <pic:nvPicPr>
-                    <pic:cNvPr descr="C:/Users/laxmi/AppData/Local/Temp/nova-docs-220cb107/architecture-1.png" id="17" name="Picture"/>
+                    <pic:cNvPr descr="C:/Users/laxmi/AppData/Local/Temp/nova-docs-661f5b5e/architecture-1.png" id="17" name="Picture"/>
                     <pic:cNvPicPr>
                       <a:picLocks noChangeArrowheads="1" noChangeAspect="1"/>
                     </pic:cNvPicPr>
@@ -2334,7 +2334,7 @@
               <a:graphicData uri="http://schemas.openxmlformats.org/drawingml/2006/picture">
                 <pic:pic>
                   <pic:nvPicPr>
-                    <pic:cNvPr descr="C:/Users/laxmi/AppData/Local/Temp/nova-docs-220cb107/architecture-2.png" id="28" name="Picture"/>
+                    <pic:cNvPr descr="C:/Users/laxmi/AppData/Local/Temp/nova-docs-661f5b5e/architecture-2.png" id="28" name="Picture"/>
                     <pic:cNvPicPr>
                       <a:picLocks noChangeArrowheads="1" noChangeAspect="1"/>
                     </pic:cNvPicPr>
@@ -2391,7 +2391,7 @@
               <a:graphicData uri="http://schemas.openxmlformats.org/drawingml/2006/picture">
                 <pic:pic>
                   <pic:nvPicPr>
-                    <pic:cNvPr descr="C:/Users/laxmi/AppData/Local/Temp/nova-docs-220cb107/architecture-3.png" id="32" name="Picture"/>
+                    <pic:cNvPr descr="C:/Users/laxmi/AppData/Local/Temp/nova-docs-661f5b5e/architecture-3.png" id="32" name="Picture"/>
                     <pic:cNvPicPr>
                       <a:picLocks noChangeArrowheads="1" noChangeAspect="1"/>
                     </pic:cNvPicPr>
@@ -2917,7 +2917,7 @@
               <a:graphicData uri="http://schemas.openxmlformats.org/drawingml/2006/picture">
                 <pic:pic>
                   <pic:nvPicPr>
-                    <pic:cNvPr descr="C:/Users/laxmi/AppData/Local/Temp/nova-docs-220cb107/architecture-4.png" id="38" name="Picture"/>
+                    <pic:cNvPr descr="C:/Users/laxmi/AppData/Local/Temp/nova-docs-661f5b5e/architecture-4.png" id="38" name="Picture"/>
                     <pic:cNvPicPr>
                       <a:picLocks noChangeArrowheads="1" noChangeAspect="1"/>
                     </pic:cNvPicPr>
@@ -2974,7 +2974,7 @@
               <a:graphicData uri="http://schemas.openxmlformats.org/drawingml/2006/picture">
                 <pic:pic>
                   <pic:nvPicPr>
-                    <pic:cNvPr descr="C:/Users/laxmi/AppData/Local/Temp/nova-docs-220cb107/architecture-5.png" id="42" name="Picture"/>
+                    <pic:cNvPr descr="C:/Users/laxmi/AppData/Local/Temp/nova-docs-661f5b5e/architecture-5.png" id="42" name="Picture"/>
                     <pic:cNvPicPr>
                       <a:picLocks noChangeArrowheads="1" noChangeAspect="1"/>
                     </pic:cNvPicPr>
@@ -3031,7 +3031,7 @@
               <a:graphicData uri="http://schemas.openxmlformats.org/drawingml/2006/picture">
                 <pic:pic>
                   <pic:nvPicPr>
-                    <pic:cNvPr descr="C:/Users/laxmi/AppData/Local/Temp/nova-docs-220cb107/architecture-6.png" id="46" name="Picture"/>
+                    <pic:cNvPr descr="C:/Users/laxmi/AppData/Local/Temp/nova-docs-661f5b5e/architecture-6.png" id="46" name="Picture"/>
                     <pic:cNvPicPr>
                       <a:picLocks noChangeArrowheads="1" noChangeAspect="1"/>
                     </pic:cNvPicPr>
@@ -3394,7 +3394,7 @@
               <a:graphicData uri="http://schemas.openxmlformats.org/drawingml/2006/picture">
                 <pic:pic>
                   <pic:nvPicPr>
-                    <pic:cNvPr descr="C:/Users/laxmi/AppData/Local/Temp/nova-docs-220cb107/architecture-7.png" id="52" name="Picture"/>
+                    <pic:cNvPr descr="C:/Users/laxmi/AppData/Local/Temp/nova-docs-661f5b5e/architecture-7.png" id="52" name="Picture"/>
                     <pic:cNvPicPr>
                       <a:picLocks noChangeArrowheads="1" noChangeAspect="1"/>
                     </pic:cNvPicPr>
@@ -3803,7 +3803,7 @@
               <a:graphicData uri="http://schemas.openxmlformats.org/drawingml/2006/picture">
                 <pic:pic>
                   <pic:nvPicPr>
-                    <pic:cNvPr descr="C:/Users/laxmi/AppData/Local/Temp/nova-docs-220cb107/architecture-8.png" id="58" name="Picture"/>
+                    <pic:cNvPr descr="C:/Users/laxmi/AppData/Local/Temp/nova-docs-661f5b5e/architecture-8.png" id="58" name="Picture"/>
                     <pic:cNvPicPr>
                       <a:picLocks noChangeArrowheads="1" noChangeAspect="1"/>
                     </pic:cNvPicPr>
@@ -5134,7 +5134,7 @@
               <a:graphicData uri="http://schemas.openxmlformats.org/drawingml/2006/picture">
                 <pic:pic>
                   <pic:nvPicPr>
-                    <pic:cNvPr descr="C:/Users/laxmi/AppData/Local/Temp/nova-docs-220cb107/architecture-9.png" id="74" name="Picture"/>
+                    <pic:cNvPr descr="C:/Users/laxmi/AppData/Local/Temp/nova-docs-661f5b5e/architecture-9.png" id="74" name="Picture"/>
                     <pic:cNvPicPr>
                       <a:picLocks noChangeArrowheads="1" noChangeAspect="1"/>
                     </pic:cNvPicPr>

</xml_diff>

<commit_message>
Record the datastore digest in full, drop the editor ignore
The truncated digest in NOVA-SPK-003 was the only ellipsis in the repository
and less useful than the digest itself.

Editor and agent directories move to .git/info/exclude, which is where local
tooling belongs rather than in a file everyone who clones this reads.
</commit_message>
<xml_diff>
--- a/docs/dist/architecture.docx
+++ b/docs/dist/architecture.docx
@@ -1543,7 +1543,7 @@
               <a:graphicData uri="http://schemas.openxmlformats.org/drawingml/2006/picture">
                 <pic:pic>
                   <pic:nvPicPr>
-                    <pic:cNvPr descr="C:/Users/laxmi/AppData/Local/Temp/nova-docs-673141bd/architecture-1.png" id="17" name="Picture"/>
+                    <pic:cNvPr descr="C:/Users/laxmi/AppData/Local/Temp/nova-docs-6bc4c78f/architecture-1.png" id="17" name="Picture"/>
                     <pic:cNvPicPr>
                       <a:picLocks noChangeArrowheads="1" noChangeAspect="1"/>
                     </pic:cNvPicPr>
@@ -2334,7 +2334,7 @@
               <a:graphicData uri="http://schemas.openxmlformats.org/drawingml/2006/picture">
                 <pic:pic>
                   <pic:nvPicPr>
-                    <pic:cNvPr descr="C:/Users/laxmi/AppData/Local/Temp/nova-docs-673141bd/architecture-2.png" id="28" name="Picture"/>
+                    <pic:cNvPr descr="C:/Users/laxmi/AppData/Local/Temp/nova-docs-6bc4c78f/architecture-2.png" id="28" name="Picture"/>
                     <pic:cNvPicPr>
                       <a:picLocks noChangeArrowheads="1" noChangeAspect="1"/>
                     </pic:cNvPicPr>
@@ -2391,7 +2391,7 @@
               <a:graphicData uri="http://schemas.openxmlformats.org/drawingml/2006/picture">
                 <pic:pic>
                   <pic:nvPicPr>
-                    <pic:cNvPr descr="C:/Users/laxmi/AppData/Local/Temp/nova-docs-673141bd/architecture-3.png" id="32" name="Picture"/>
+                    <pic:cNvPr descr="C:/Users/laxmi/AppData/Local/Temp/nova-docs-6bc4c78f/architecture-3.png" id="32" name="Picture"/>
                     <pic:cNvPicPr>
                       <a:picLocks noChangeArrowheads="1" noChangeAspect="1"/>
                     </pic:cNvPicPr>
@@ -2917,7 +2917,7 @@
               <a:graphicData uri="http://schemas.openxmlformats.org/drawingml/2006/picture">
                 <pic:pic>
                   <pic:nvPicPr>
-                    <pic:cNvPr descr="C:/Users/laxmi/AppData/Local/Temp/nova-docs-673141bd/architecture-4.png" id="38" name="Picture"/>
+                    <pic:cNvPr descr="C:/Users/laxmi/AppData/Local/Temp/nova-docs-6bc4c78f/architecture-4.png" id="38" name="Picture"/>
                     <pic:cNvPicPr>
                       <a:picLocks noChangeArrowheads="1" noChangeAspect="1"/>
                     </pic:cNvPicPr>
@@ -2974,7 +2974,7 @@
               <a:graphicData uri="http://schemas.openxmlformats.org/drawingml/2006/picture">
                 <pic:pic>
                   <pic:nvPicPr>
-                    <pic:cNvPr descr="C:/Users/laxmi/AppData/Local/Temp/nova-docs-673141bd/architecture-5.png" id="42" name="Picture"/>
+                    <pic:cNvPr descr="C:/Users/laxmi/AppData/Local/Temp/nova-docs-6bc4c78f/architecture-5.png" id="42" name="Picture"/>
                     <pic:cNvPicPr>
                       <a:picLocks noChangeArrowheads="1" noChangeAspect="1"/>
                     </pic:cNvPicPr>
@@ -3031,7 +3031,7 @@
               <a:graphicData uri="http://schemas.openxmlformats.org/drawingml/2006/picture">
                 <pic:pic>
                   <pic:nvPicPr>
-                    <pic:cNvPr descr="C:/Users/laxmi/AppData/Local/Temp/nova-docs-673141bd/architecture-6.png" id="46" name="Picture"/>
+                    <pic:cNvPr descr="C:/Users/laxmi/AppData/Local/Temp/nova-docs-6bc4c78f/architecture-6.png" id="46" name="Picture"/>
                     <pic:cNvPicPr>
                       <a:picLocks noChangeArrowheads="1" noChangeAspect="1"/>
                     </pic:cNvPicPr>
@@ -3394,7 +3394,7 @@
               <a:graphicData uri="http://schemas.openxmlformats.org/drawingml/2006/picture">
                 <pic:pic>
                   <pic:nvPicPr>
-                    <pic:cNvPr descr="C:/Users/laxmi/AppData/Local/Temp/nova-docs-673141bd/architecture-7.png" id="52" name="Picture"/>
+                    <pic:cNvPr descr="C:/Users/laxmi/AppData/Local/Temp/nova-docs-6bc4c78f/architecture-7.png" id="52" name="Picture"/>
                     <pic:cNvPicPr>
                       <a:picLocks noChangeArrowheads="1" noChangeAspect="1"/>
                     </pic:cNvPicPr>
@@ -3803,7 +3803,7 @@
               <a:graphicData uri="http://schemas.openxmlformats.org/drawingml/2006/picture">
                 <pic:pic>
                   <pic:nvPicPr>
-                    <pic:cNvPr descr="C:/Users/laxmi/AppData/Local/Temp/nova-docs-673141bd/architecture-8.png" id="58" name="Picture"/>
+                    <pic:cNvPr descr="C:/Users/laxmi/AppData/Local/Temp/nova-docs-6bc4c78f/architecture-8.png" id="58" name="Picture"/>
                     <pic:cNvPicPr>
                       <a:picLocks noChangeArrowheads="1" noChangeAspect="1"/>
                     </pic:cNvPicPr>
@@ -5134,7 +5134,7 @@
               <a:graphicData uri="http://schemas.openxmlformats.org/drawingml/2006/picture">
                 <pic:pic>
                   <pic:nvPicPr>
-                    <pic:cNvPr descr="C:/Users/laxmi/AppData/Local/Temp/nova-docs-673141bd/architecture-9.png" id="74" name="Picture"/>
+                    <pic:cNvPr descr="C:/Users/laxmi/AppData/Local/Temp/nova-docs-6bc4c78f/architecture-9.png" id="74" name="Picture"/>
                     <pic:cNvPicPr>
                       <a:picLocks noChangeArrowheads="1" noChangeAspect="1"/>
                     </pic:cNvPicPr>

</xml_diff>

<commit_message>
Tighten two phrasings in NOVA-SPK-003
</commit_message>
<xml_diff>
--- a/docs/dist/architecture.docx
+++ b/docs/dist/architecture.docx
@@ -1543,7 +1543,7 @@
               <a:graphicData uri="http://schemas.openxmlformats.org/drawingml/2006/picture">
                 <pic:pic>
                   <pic:nvPicPr>
-                    <pic:cNvPr descr="C:/Users/laxmi/AppData/Local/Temp/nova-docs-6bc4c78f/architecture-1.png" id="17" name="Picture"/>
+                    <pic:cNvPr descr="C:/Users/laxmi/AppData/Local/Temp/nova-docs-ae6bfa96/architecture-1.png" id="17" name="Picture"/>
                     <pic:cNvPicPr>
                       <a:picLocks noChangeArrowheads="1" noChangeAspect="1"/>
                     </pic:cNvPicPr>
@@ -2334,7 +2334,7 @@
               <a:graphicData uri="http://schemas.openxmlformats.org/drawingml/2006/picture">
                 <pic:pic>
                   <pic:nvPicPr>
-                    <pic:cNvPr descr="C:/Users/laxmi/AppData/Local/Temp/nova-docs-6bc4c78f/architecture-2.png" id="28" name="Picture"/>
+                    <pic:cNvPr descr="C:/Users/laxmi/AppData/Local/Temp/nova-docs-ae6bfa96/architecture-2.png" id="28" name="Picture"/>
                     <pic:cNvPicPr>
                       <a:picLocks noChangeArrowheads="1" noChangeAspect="1"/>
                     </pic:cNvPicPr>
@@ -2391,7 +2391,7 @@
               <a:graphicData uri="http://schemas.openxmlformats.org/drawingml/2006/picture">
                 <pic:pic>
                   <pic:nvPicPr>
-                    <pic:cNvPr descr="C:/Users/laxmi/AppData/Local/Temp/nova-docs-6bc4c78f/architecture-3.png" id="32" name="Picture"/>
+                    <pic:cNvPr descr="C:/Users/laxmi/AppData/Local/Temp/nova-docs-ae6bfa96/architecture-3.png" id="32" name="Picture"/>
                     <pic:cNvPicPr>
                       <a:picLocks noChangeArrowheads="1" noChangeAspect="1"/>
                     </pic:cNvPicPr>
@@ -2917,7 +2917,7 @@
               <a:graphicData uri="http://schemas.openxmlformats.org/drawingml/2006/picture">
                 <pic:pic>
                   <pic:nvPicPr>
-                    <pic:cNvPr descr="C:/Users/laxmi/AppData/Local/Temp/nova-docs-6bc4c78f/architecture-4.png" id="38" name="Picture"/>
+                    <pic:cNvPr descr="C:/Users/laxmi/AppData/Local/Temp/nova-docs-ae6bfa96/architecture-4.png" id="38" name="Picture"/>
                     <pic:cNvPicPr>
                       <a:picLocks noChangeArrowheads="1" noChangeAspect="1"/>
                     </pic:cNvPicPr>
@@ -2974,7 +2974,7 @@
               <a:graphicData uri="http://schemas.openxmlformats.org/drawingml/2006/picture">
                 <pic:pic>
                   <pic:nvPicPr>
-                    <pic:cNvPr descr="C:/Users/laxmi/AppData/Local/Temp/nova-docs-6bc4c78f/architecture-5.png" id="42" name="Picture"/>
+                    <pic:cNvPr descr="C:/Users/laxmi/AppData/Local/Temp/nova-docs-ae6bfa96/architecture-5.png" id="42" name="Picture"/>
                     <pic:cNvPicPr>
                       <a:picLocks noChangeArrowheads="1" noChangeAspect="1"/>
                     </pic:cNvPicPr>
@@ -3031,7 +3031,7 @@
               <a:graphicData uri="http://schemas.openxmlformats.org/drawingml/2006/picture">
                 <pic:pic>
                   <pic:nvPicPr>
-                    <pic:cNvPr descr="C:/Users/laxmi/AppData/Local/Temp/nova-docs-6bc4c78f/architecture-6.png" id="46" name="Picture"/>
+                    <pic:cNvPr descr="C:/Users/laxmi/AppData/Local/Temp/nova-docs-ae6bfa96/architecture-6.png" id="46" name="Picture"/>
                     <pic:cNvPicPr>
                       <a:picLocks noChangeArrowheads="1" noChangeAspect="1"/>
                     </pic:cNvPicPr>
@@ -3394,7 +3394,7 @@
               <a:graphicData uri="http://schemas.openxmlformats.org/drawingml/2006/picture">
                 <pic:pic>
                   <pic:nvPicPr>
-                    <pic:cNvPr descr="C:/Users/laxmi/AppData/Local/Temp/nova-docs-6bc4c78f/architecture-7.png" id="52" name="Picture"/>
+                    <pic:cNvPr descr="C:/Users/laxmi/AppData/Local/Temp/nova-docs-ae6bfa96/architecture-7.png" id="52" name="Picture"/>
                     <pic:cNvPicPr>
                       <a:picLocks noChangeArrowheads="1" noChangeAspect="1"/>
                     </pic:cNvPicPr>
@@ -3803,7 +3803,7 @@
               <a:graphicData uri="http://schemas.openxmlformats.org/drawingml/2006/picture">
                 <pic:pic>
                   <pic:nvPicPr>
-                    <pic:cNvPr descr="C:/Users/laxmi/AppData/Local/Temp/nova-docs-6bc4c78f/architecture-8.png" id="58" name="Picture"/>
+                    <pic:cNvPr descr="C:/Users/laxmi/AppData/Local/Temp/nova-docs-ae6bfa96/architecture-8.png" id="58" name="Picture"/>
                     <pic:cNvPicPr>
                       <a:picLocks noChangeArrowheads="1" noChangeAspect="1"/>
                     </pic:cNvPicPr>
@@ -5134,7 +5134,7 @@
               <a:graphicData uri="http://schemas.openxmlformats.org/drawingml/2006/picture">
                 <pic:pic>
                   <pic:nvPicPr>
-                    <pic:cNvPr descr="C:/Users/laxmi/AppData/Local/Temp/nova-docs-6bc4c78f/architecture-9.png" id="74" name="Picture"/>
+                    <pic:cNvPr descr="C:/Users/laxmi/AppData/Local/Temp/nova-docs-ae6bfa96/architecture-9.png" id="74" name="Picture"/>
                     <pic:cNvPicPr>
                       <a:picLocks noChangeArrowheads="1" noChangeAspect="1"/>
                     </pic:cNvPicPr>

</xml_diff>

<commit_message>
Close M1 on a green pipeline
First run passed in 32s. The SDP said the workflow was written but unrun,
which is no longer true.

checkout and setup-python bumped off the deprecated Node 20 runtime.
</commit_message>
<xml_diff>
--- a/docs/dist/architecture.docx
+++ b/docs/dist/architecture.docx
@@ -1543,7 +1543,7 @@
               <a:graphicData uri="http://schemas.openxmlformats.org/drawingml/2006/picture">
                 <pic:pic>
                   <pic:nvPicPr>
-                    <pic:cNvPr descr="C:/Users/laxmi/AppData/Local/Temp/nova-docs-ae6bfa96/architecture-1.png" id="17" name="Picture"/>
+                    <pic:cNvPr descr="C:/Users/laxmi/AppData/Local/Temp/nova-docs-b9545df6/architecture-1.png" id="17" name="Picture"/>
                     <pic:cNvPicPr>
                       <a:picLocks noChangeArrowheads="1" noChangeAspect="1"/>
                     </pic:cNvPicPr>
@@ -2334,7 +2334,7 @@
               <a:graphicData uri="http://schemas.openxmlformats.org/drawingml/2006/picture">
                 <pic:pic>
                   <pic:nvPicPr>
-                    <pic:cNvPr descr="C:/Users/laxmi/AppData/Local/Temp/nova-docs-ae6bfa96/architecture-2.png" id="28" name="Picture"/>
+                    <pic:cNvPr descr="C:/Users/laxmi/AppData/Local/Temp/nova-docs-b9545df6/architecture-2.png" id="28" name="Picture"/>
                     <pic:cNvPicPr>
                       <a:picLocks noChangeArrowheads="1" noChangeAspect="1"/>
                     </pic:cNvPicPr>
@@ -2391,7 +2391,7 @@
               <a:graphicData uri="http://schemas.openxmlformats.org/drawingml/2006/picture">
                 <pic:pic>
                   <pic:nvPicPr>
-                    <pic:cNvPr descr="C:/Users/laxmi/AppData/Local/Temp/nova-docs-ae6bfa96/architecture-3.png" id="32" name="Picture"/>
+                    <pic:cNvPr descr="C:/Users/laxmi/AppData/Local/Temp/nova-docs-b9545df6/architecture-3.png" id="32" name="Picture"/>
                     <pic:cNvPicPr>
                       <a:picLocks noChangeArrowheads="1" noChangeAspect="1"/>
                     </pic:cNvPicPr>
@@ -2917,7 +2917,7 @@
               <a:graphicData uri="http://schemas.openxmlformats.org/drawingml/2006/picture">
                 <pic:pic>
                   <pic:nvPicPr>
-                    <pic:cNvPr descr="C:/Users/laxmi/AppData/Local/Temp/nova-docs-ae6bfa96/architecture-4.png" id="38" name="Picture"/>
+                    <pic:cNvPr descr="C:/Users/laxmi/AppData/Local/Temp/nova-docs-b9545df6/architecture-4.png" id="38" name="Picture"/>
                     <pic:cNvPicPr>
                       <a:picLocks noChangeArrowheads="1" noChangeAspect="1"/>
                     </pic:cNvPicPr>
@@ -2974,7 +2974,7 @@
               <a:graphicData uri="http://schemas.openxmlformats.org/drawingml/2006/picture">
                 <pic:pic>
                   <pic:nvPicPr>
-                    <pic:cNvPr descr="C:/Users/laxmi/AppData/Local/Temp/nova-docs-ae6bfa96/architecture-5.png" id="42" name="Picture"/>
+                    <pic:cNvPr descr="C:/Users/laxmi/AppData/Local/Temp/nova-docs-b9545df6/architecture-5.png" id="42" name="Picture"/>
                     <pic:cNvPicPr>
                       <a:picLocks noChangeArrowheads="1" noChangeAspect="1"/>
                     </pic:cNvPicPr>
@@ -3031,7 +3031,7 @@
               <a:graphicData uri="http://schemas.openxmlformats.org/drawingml/2006/picture">
                 <pic:pic>
                   <pic:nvPicPr>
-                    <pic:cNvPr descr="C:/Users/laxmi/AppData/Local/Temp/nova-docs-ae6bfa96/architecture-6.png" id="46" name="Picture"/>
+                    <pic:cNvPr descr="C:/Users/laxmi/AppData/Local/Temp/nova-docs-b9545df6/architecture-6.png" id="46" name="Picture"/>
                     <pic:cNvPicPr>
                       <a:picLocks noChangeArrowheads="1" noChangeAspect="1"/>
                     </pic:cNvPicPr>
@@ -3394,7 +3394,7 @@
               <a:graphicData uri="http://schemas.openxmlformats.org/drawingml/2006/picture">
                 <pic:pic>
                   <pic:nvPicPr>
-                    <pic:cNvPr descr="C:/Users/laxmi/AppData/Local/Temp/nova-docs-ae6bfa96/architecture-7.png" id="52" name="Picture"/>
+                    <pic:cNvPr descr="C:/Users/laxmi/AppData/Local/Temp/nova-docs-b9545df6/architecture-7.png" id="52" name="Picture"/>
                     <pic:cNvPicPr>
                       <a:picLocks noChangeArrowheads="1" noChangeAspect="1"/>
                     </pic:cNvPicPr>
@@ -3803,7 +3803,7 @@
               <a:graphicData uri="http://schemas.openxmlformats.org/drawingml/2006/picture">
                 <pic:pic>
                   <pic:nvPicPr>
-                    <pic:cNvPr descr="C:/Users/laxmi/AppData/Local/Temp/nova-docs-ae6bfa96/architecture-8.png" id="58" name="Picture"/>
+                    <pic:cNvPr descr="C:/Users/laxmi/AppData/Local/Temp/nova-docs-b9545df6/architecture-8.png" id="58" name="Picture"/>
                     <pic:cNvPicPr>
                       <a:picLocks noChangeArrowheads="1" noChangeAspect="1"/>
                     </pic:cNvPicPr>
@@ -5134,7 +5134,7 @@
               <a:graphicData uri="http://schemas.openxmlformats.org/drawingml/2006/picture">
                 <pic:pic>
                   <pic:nvPicPr>
-                    <pic:cNvPr descr="C:/Users/laxmi/AppData/Local/Temp/nova-docs-ae6bfa96/architecture-9.png" id="74" name="Picture"/>
+                    <pic:cNvPr descr="C:/Users/laxmi/AppData/Local/Temp/nova-docs-b9545df6/architecture-9.png" id="74" name="Picture"/>
                     <pic:cNvPicPr>
                       <a:picLocks noChangeArrowheads="1" noChangeAspect="1"/>
                     </pic:cNvPicPr>

</xml_diff>